<commit_message>
update: content state machine
</commit_message>
<xml_diff>
--- a/DOCX/TaiLieuThietKe/13_Thiet_ke_state_machine_cua_ticket.docx
+++ b/DOCX/TaiLieuThietKe/13_Thiet_ke_state_machine_cua_ticket.docx
@@ -1169,52 +1169,78 @@
         <w:spacing w:before="0" w:after="0" w:line="360" w:lineRule="auto"/>
       </w:pPr>
       <w:r>
+        <w:lastRenderedPageBreak/>
         <w:t>13.3. Sơ đồ chuyển trạng thái Ticket</w:t>
       </w:r>
     </w:p>
     <w:p>
       <w:pPr>
-        <w:spacing w:after="0" w:line="360" w:lineRule="auto"/>
-        <w:jc w:val="both"/>
-      </w:pPr>
-      <w:r>
+        <w:pStyle w:val="Caption"/>
+        <w:rPr>
+          <w:lang w:val="vi-VN"/>
+        </w:rPr>
+      </w:pPr>
+      <w:r>
+        <w:rPr>
+          <w:lang w:val="vi-VN"/>
+        </w:rPr>
+        <w:drawing>
+          <wp:inline distT="0" distB="0" distL="0" distR="0" wp14:anchorId="19D5A7DB" wp14:editId="6F467F45">
+            <wp:extent cx="5731510" cy="4148455"/>
+            <wp:effectExtent l="0" t="0" r="2540" b="4445"/>
+            <wp:docPr id="621739188" name="Picture 1"/>
+            <wp:cNvGraphicFramePr>
+              <a:graphicFrameLocks xmlns:a="http://schemas.openxmlformats.org/drawingml/2006/main" noChangeAspect="1"/>
+            </wp:cNvGraphicFramePr>
+            <a:graphic xmlns:a="http://schemas.openxmlformats.org/drawingml/2006/main">
+              <a:graphicData uri="http://schemas.openxmlformats.org/drawingml/2006/picture">
+                <pic:pic xmlns:pic="http://schemas.openxmlformats.org/drawingml/2006/picture">
+                  <pic:nvPicPr>
+                    <pic:cNvPr id="621739188" name=""/>
+                    <pic:cNvPicPr/>
+                  </pic:nvPicPr>
+                  <pic:blipFill>
+                    <a:blip r:embed="rId6"/>
+                    <a:stretch>
+                      <a:fillRect/>
+                    </a:stretch>
+                  </pic:blipFill>
+                  <pic:spPr>
+                    <a:xfrm>
+                      <a:off x="0" y="0"/>
+                      <a:ext cx="5731510" cy="4148455"/>
+                    </a:xfrm>
+                    <a:prstGeom prst="rect">
+                      <a:avLst/>
+                    </a:prstGeom>
+                  </pic:spPr>
+                </pic:pic>
+              </a:graphicData>
+            </a:graphic>
+          </wp:inline>
+        </w:drawing>
+      </w:r>
+    </w:p>
+    <w:p>
+      <w:pPr>
+        <w:pStyle w:val="Caption"/>
         <w:rPr>
           <w:b/>
           <w:bCs/>
-        </w:rPr>
-        <w:t>[CHÈN HÌNH TICKET_STATE_MACHINE.PNG TẠI ĐÂY]</w:t>
-      </w:r>
-    </w:p>
-    <w:p>
-      <w:pPr>
-        <w:pStyle w:val="Caption"/>
-        <w:rPr>
-          <w:b/>
-          <w:bCs/>
           <w:lang w:val="vi-VN"/>
         </w:rPr>
       </w:pPr>
       <w:r>
         <w:t xml:space="preserve">Hình </w:t>
       </w:r>
-      <w:r>
-        <w:fldChar w:fldCharType="begin"/>
-      </w:r>
-      <w:r>
-        <w:instrText xml:space="preserve"> SEQ Hình \* ARABIC </w:instrText>
-      </w:r>
-      <w:r>
-        <w:fldChar w:fldCharType="separate"/>
-      </w:r>
-      <w:r>
-        <w:rPr>
-          <w:noProof/>
-        </w:rPr>
-        <w:t>1</w:t>
-      </w:r>
-      <w:r>
-        <w:fldChar w:fldCharType="end"/>
-      </w:r>
+      <w:fldSimple w:instr=" SEQ Hình \* ARABIC ">
+        <w:r>
+          <w:rPr>
+            <w:noProof/>
+          </w:rPr>
+          <w:t>1</w:t>
+        </w:r>
+      </w:fldSimple>
       <w:r>
         <w:rPr>
           <w:lang w:val="vi-VN"/>
@@ -1518,7 +1544,6 @@
         <w:jc w:val="both"/>
       </w:pPr>
       <w:r>
-        <w:lastRenderedPageBreak/>
         <w:t>Các transition không được xác định trong State Machine được xem là không hợp lệ và phải bị Application Server từ chối.</w:t>
       </w:r>
     </w:p>
@@ -1528,6 +1553,7 @@
         <w:spacing w:before="0" w:after="0" w:line="360" w:lineRule="auto"/>
       </w:pPr>
       <w:r>
+        <w:lastRenderedPageBreak/>
         <w:t>13.4. Quy tắc chuyển trạng thái chi tiết</w:t>
       </w:r>
     </w:p>
@@ -2021,65 +2047,68 @@
               <w:spacing w:line="360" w:lineRule="auto"/>
             </w:pPr>
             <w:r>
+              <w:t>IN_PROGRESS</w:t>
+            </w:r>
+          </w:p>
+        </w:tc>
+        <w:tc>
+          <w:tcPr>
+            <w:tcW w:w="1161" w:type="pct"/>
+            <w:hideMark/>
+          </w:tcPr>
+          <w:p>
+            <w:pPr>
+              <w:spacing w:line="360" w:lineRule="auto"/>
+            </w:pPr>
+            <w:r>
+              <w:t>PENDING_INFO</w:t>
+            </w:r>
+          </w:p>
+        </w:tc>
+        <w:tc>
+          <w:tcPr>
+            <w:tcW w:w="824" w:type="pct"/>
+            <w:hideMark/>
+          </w:tcPr>
+          <w:p>
+            <w:pPr>
+              <w:spacing w:line="360" w:lineRule="auto"/>
+            </w:pPr>
+            <w:r>
+              <w:t>Yêu cầu bổ sung thông tin</w:t>
+            </w:r>
+          </w:p>
+        </w:tc>
+        <w:tc>
+          <w:tcPr>
+            <w:tcW w:w="858" w:type="pct"/>
+            <w:hideMark/>
+          </w:tcPr>
+          <w:p>
+            <w:pPr>
+              <w:spacing w:line="360" w:lineRule="auto"/>
+            </w:pPr>
+            <w:r>
+              <w:t>Người xử lý</w:t>
+            </w:r>
+          </w:p>
+        </w:tc>
+        <w:tc>
+          <w:tcPr>
+            <w:tcW w:w="992" w:type="pct"/>
+            <w:hideMark/>
+          </w:tcPr>
+          <w:p>
+            <w:pPr>
+              <w:spacing w:line="360" w:lineRule="auto"/>
+              <w:jc w:val="both"/>
+            </w:pPr>
+            <w:r>
+              <w:t xml:space="preserve">Thông tin hiện tại chưa đủ để tiếp tục xử lý. </w:t>
+            </w:r>
+            <w:r>
               <w:lastRenderedPageBreak/>
-              <w:t>IN_PROGRESS</w:t>
-            </w:r>
-          </w:p>
-        </w:tc>
-        <w:tc>
-          <w:tcPr>
-            <w:tcW w:w="1161" w:type="pct"/>
-            <w:hideMark/>
-          </w:tcPr>
-          <w:p>
-            <w:pPr>
-              <w:spacing w:line="360" w:lineRule="auto"/>
-            </w:pPr>
-            <w:r>
-              <w:t>PENDING_INFO</w:t>
-            </w:r>
-          </w:p>
-        </w:tc>
-        <w:tc>
-          <w:tcPr>
-            <w:tcW w:w="824" w:type="pct"/>
-            <w:hideMark/>
-          </w:tcPr>
-          <w:p>
-            <w:pPr>
-              <w:spacing w:line="360" w:lineRule="auto"/>
-            </w:pPr>
-            <w:r>
-              <w:t>Yêu cầu bổ sung thông tin</w:t>
-            </w:r>
-          </w:p>
-        </w:tc>
-        <w:tc>
-          <w:tcPr>
-            <w:tcW w:w="858" w:type="pct"/>
-            <w:hideMark/>
-          </w:tcPr>
-          <w:p>
-            <w:pPr>
-              <w:spacing w:line="360" w:lineRule="auto"/>
-            </w:pPr>
-            <w:r>
-              <w:t>Người xử lý</w:t>
-            </w:r>
-          </w:p>
-        </w:tc>
-        <w:tc>
-          <w:tcPr>
-            <w:tcW w:w="992" w:type="pct"/>
-            <w:hideMark/>
-          </w:tcPr>
-          <w:p>
-            <w:pPr>
-              <w:spacing w:line="360" w:lineRule="auto"/>
-              <w:jc w:val="both"/>
-            </w:pPr>
-            <w:r>
-              <w:t>Thông tin hiện tại chưa đủ để tiếp tục xử lý. Nội dung yêu cầu bổ sung không được để trống.</w:t>
+              <w:t>Nội dung yêu cầu bổ sung không được để trống.</w:t>
             </w:r>
           </w:p>
         </w:tc>
@@ -2095,6 +2124,7 @@
               <w:spacing w:line="360" w:lineRule="auto"/>
             </w:pPr>
             <w:r>
+              <w:lastRenderedPageBreak/>
               <w:t>PENDING_INFO</w:t>
             </w:r>
           </w:p>
@@ -2370,11 +2400,7 @@
               <w:t>”</w:t>
             </w:r>
             <w:r>
-              <w:t xml:space="preserve"> đóng trong trường hợp đặc biệt theo </w:t>
-            </w:r>
-            <w:r>
-              <w:lastRenderedPageBreak/>
-              <w:t>Business Rules.</w:t>
+              <w:t xml:space="preserve"> đóng trong trường hợp đặc biệt theo Business Rules.</w:t>
             </w:r>
           </w:p>
         </w:tc>
@@ -2827,7 +2853,6 @@
         <w:rPr>
           <w:lang w:val="vi-VN"/>
         </w:rPr>
-        <w:lastRenderedPageBreak/>
         <w:t>“</w:t>
       </w:r>
       <w:r>
@@ -2861,6 +2886,7 @@
         <w:spacing w:before="0" w:after="0" w:line="360" w:lineRule="auto"/>
       </w:pPr>
       <w:r>
+        <w:lastRenderedPageBreak/>
         <w:t>13.5. Ma trận kiểm soát chuyển đổi trạng thái</w:t>
       </w:r>
     </w:p>
@@ -4487,7 +4513,6 @@
         <w:jc w:val="both"/>
       </w:pPr>
       <w:r>
-        <w:lastRenderedPageBreak/>
         <w:t xml:space="preserve">ASSIGNED </w:t>
       </w:r>
       <w:r>
@@ -4532,6 +4557,7 @@
         <w:jc w:val="both"/>
       </w:pPr>
       <w:r>
+        <w:lastRenderedPageBreak/>
         <w:t xml:space="preserve">IN_PROGRESS </w:t>
       </w:r>
       <w:r>
@@ -5025,7 +5051,6 @@
         <w:jc w:val="both"/>
       </w:pPr>
       <w:r>
-        <w:lastRenderedPageBreak/>
         <w:t>Kiểm tra:</w:t>
       </w:r>
     </w:p>
@@ -5063,6 +5088,7 @@
         <w:jc w:val="both"/>
       </w:pPr>
       <w:r>
+        <w:lastRenderedPageBreak/>
         <w:t xml:space="preserve">Vai trò là </w:t>
       </w:r>
       <w:r>
@@ -5549,49 +5575,49 @@
         <w:ind w:left="709" w:hanging="709"/>
       </w:pPr>
       <w:r>
+        <w:t>PENDING_INFO</w:t>
+      </w:r>
+    </w:p>
+    <w:p>
+      <w:pPr>
+        <w:spacing w:after="0" w:line="360" w:lineRule="auto"/>
+        <w:jc w:val="both"/>
+      </w:pPr>
+      <w:r>
+        <w:t>Khi ticket chuyển từ:</w:t>
+      </w:r>
+      <w:r>
+        <w:rPr>
+          <w:lang w:val="vi-VN"/>
+        </w:rPr>
+        <w:t xml:space="preserve"> </w:t>
+      </w:r>
+      <w:r>
+        <w:t xml:space="preserve">IN_PROGRESS </w:t>
+      </w:r>
+      <w:r>
+        <w:rPr>
+          <w:lang w:val="vi-VN"/>
+        </w:rPr>
+        <w:sym w:font="Wingdings" w:char="F0E0"/>
+      </w:r>
+      <w:r>
+        <w:rPr>
+          <w:lang w:val="vi-VN"/>
+        </w:rPr>
+        <w:t xml:space="preserve"> </w:t>
+      </w:r>
+      <w:r>
+        <w:t>PENDING_INFO</w:t>
+      </w:r>
+    </w:p>
+    <w:p>
+      <w:pPr>
+        <w:spacing w:after="0" w:line="360" w:lineRule="auto"/>
+        <w:jc w:val="both"/>
+      </w:pPr>
+      <w:r>
         <w:lastRenderedPageBreak/>
-        <w:t>PENDING_INFO</w:t>
-      </w:r>
-    </w:p>
-    <w:p>
-      <w:pPr>
-        <w:spacing w:after="0" w:line="360" w:lineRule="auto"/>
-        <w:jc w:val="both"/>
-      </w:pPr>
-      <w:r>
-        <w:t>Khi ticket chuyển từ:</w:t>
-      </w:r>
-      <w:r>
-        <w:rPr>
-          <w:lang w:val="vi-VN"/>
-        </w:rPr>
-        <w:t xml:space="preserve"> </w:t>
-      </w:r>
-      <w:r>
-        <w:t xml:space="preserve">IN_PROGRESS </w:t>
-      </w:r>
-      <w:r>
-        <w:rPr>
-          <w:lang w:val="vi-VN"/>
-        </w:rPr>
-        <w:sym w:font="Wingdings" w:char="F0E0"/>
-      </w:r>
-      <w:r>
-        <w:rPr>
-          <w:lang w:val="vi-VN"/>
-        </w:rPr>
-        <w:t xml:space="preserve"> </w:t>
-      </w:r>
-      <w:r>
-        <w:t>PENDING_INFO</w:t>
-      </w:r>
-    </w:p>
-    <w:p>
-      <w:pPr>
-        <w:spacing w:after="0" w:line="360" w:lineRule="auto"/>
-        <w:jc w:val="both"/>
-      </w:pPr>
-      <w:r>
         <w:t>Resolution SLA được tạm dừng theo Business Rules.</w:t>
       </w:r>
     </w:p>
@@ -5922,7 +5948,6 @@
         <w:jc w:val="both"/>
       </w:pPr>
       <w:r>
-        <w:lastRenderedPageBreak/>
         <w:t>Ngoài lịch sử trạng thái của ticket, các thao tác quan trọng phải được ghi vào Audit Log theo quy tắc audit đã thiết kế.</w:t>
       </w:r>
     </w:p>
@@ -5941,6 +5966,7 @@
         <w:spacing w:before="0" w:after="0" w:line="360" w:lineRule="auto"/>
       </w:pPr>
       <w:r>
+        <w:lastRenderedPageBreak/>
         <w:t>13.9. Quy tắc xử lý transition không hợp lệ</w:t>
       </w:r>
     </w:p>
@@ -6307,25 +6333,25 @@
         <w:spacing w:before="0" w:after="0" w:line="360" w:lineRule="auto"/>
       </w:pPr>
       <w:r>
+        <w:t>13.11. Kết luận</w:t>
+      </w:r>
+    </w:p>
+    <w:p>
+      <w:pPr>
+        <w:spacing w:after="0" w:line="360" w:lineRule="auto"/>
+        <w:jc w:val="both"/>
+      </w:pPr>
+      <w:r>
+        <w:t>State Machine của ticket đã xác định tám trạng thái chính gồm NEW, ASSIGNED, IN_PROGRESS, PENDING_INFO, RESOLVED, CLOSED, REOPENED và REJECTED.</w:t>
+      </w:r>
+    </w:p>
+    <w:p>
+      <w:pPr>
+        <w:spacing w:after="0" w:line="360" w:lineRule="auto"/>
+        <w:jc w:val="both"/>
+      </w:pPr>
+      <w:r>
         <w:lastRenderedPageBreak/>
-        <w:t>13.11. Kết luận</w:t>
-      </w:r>
-    </w:p>
-    <w:p>
-      <w:pPr>
-        <w:spacing w:after="0" w:line="360" w:lineRule="auto"/>
-        <w:jc w:val="both"/>
-      </w:pPr>
-      <w:r>
-        <w:t>State Machine của ticket đã xác định tám trạng thái chính gồm NEW, ASSIGNED, IN_PROGRESS, PENDING_INFO, RESOLVED, CLOSED, REOPENED và REJECTED.</w:t>
-      </w:r>
-    </w:p>
-    <w:p>
-      <w:pPr>
-        <w:spacing w:after="0" w:line="360" w:lineRule="auto"/>
-        <w:jc w:val="both"/>
-      </w:pPr>
-      <w:r>
         <w:t>Các transition hợp lệ được xác định cụ thể thông qua sơ đồ trạng thái, bảng quy tắc chuyển trạng thái và ma trận kiểm soát transition.</w:t>
       </w:r>
     </w:p>
@@ -11232,6 +11258,7 @@
   <w:style w:type="character" w:default="1" w:styleId="DefaultParagraphFont">
     <w:name w:val="Default Paragraph Font"/>
     <w:uiPriority w:val="1"/>
+    <w:semiHidden/>
     <w:unhideWhenUsed/>
   </w:style>
   <w:style w:type="table" w:default="1" w:styleId="TableNormal">

</xml_diff>